<commit_message>
feat: polish portfolio project filtering and sections
</commit_message>
<xml_diff>
--- a/Prasun_Kumar_AI_ML_Architect_Resume.docx
+++ b/Prasun_Kumar_AI_ML_Architect_Resume.docx
@@ -550,6 +550,46 @@
     </w:p>
     <w:p>
       <w:pPr>
+        <w:spacing w:before="80" w:after="20"/>
+      </w:pPr>
+      <w:r>
+        <w:rPr>
+          <w:rFonts w:ascii="Calibri" w:hAnsi="Calibri"/>
+          <w:b/>
+          <w:color w:val="14213D"/>
+          <w:sz w:val="20"/>
+        </w:rPr>
+        <w:t>Master Level Intern | Symantec Software India Pvt Ltd</w:t>
+      </w:r>
+      <w:r>
+        <w:br/>
+      </w:r>
+      <w:r>
+        <w:rPr>
+          <w:rFonts w:ascii="Calibri" w:hAnsi="Calibri"/>
+          <w:b w:val="0"/>
+          <w:color w:val="5A5A5A"/>
+          <w:sz w:val="18"/>
+        </w:rPr>
+        <w:t>Jan 2017 - Jul 2017</w:t>
+      </w:r>
+    </w:p>
+    <w:p>
+      <w:pPr>
+        <w:pStyle w:val="ListBullet"/>
+        <w:spacing w:after="40" w:line="252" w:lineRule="auto"/>
+      </w:pPr>
+      <w:r>
+        <w:rPr>
+          <w:rFonts w:ascii="Calibri" w:hAnsi="Calibri"/>
+          <w:b w:val="0"/>
+          <w:sz w:val="19"/>
+        </w:rPr>
+        <w:t>Worked on enterprise application support and automation foundations before moving into full-time engineering.</w:t>
+      </w:r>
+    </w:p>
+    <w:p>
+      <w:pPr>
         <w:spacing w:before="160" w:after="60"/>
       </w:pPr>
       <w:r>

</xml_diff>